<commit_message>
feat: add MediaImage widget for dynamic image loading and devtools options file
- Introduced MediaImage widget to handle image rendering from server-relative or absolute URLs, ensuring compatibility with server URL overrides.
- Added a new devtools_options.yaml file to store settings for Dart & Flutter DevTools.
</commit_message>
<xml_diff>
--- a/docs/SCMS_Project_Report.docx
+++ b/docs/SCMS_Project_Report.docx
@@ -176,12 +176,16 @@
         <w:jc w:val="center"/>
         <w:rPr>
           <w:rFonts w:ascii="Bookman Old Style" w:hAnsi="Bookman Old Style"/>
+          <w:sz w:val="24"/>
+          <w:szCs w:val="24"/>
         </w:rPr>
       </w:pPr>
       <w:r>
         <w:rPr>
           <w:rFonts w:ascii="Bookman Old Style" w:hAnsi="Bookman Old Style"/>
           <w:color w:val="000000"/>
+          <w:sz w:val="24"/>
+          <w:szCs w:val="24"/>
         </w:rPr>
         <w:t>submitted by</w:t>
       </w:r>
@@ -445,22 +449,16 @@
         <w:jc w:val="center"/>
         <w:rPr>
           <w:rFonts w:ascii="Bookman Old Style" w:hAnsi="Bookman Old Style"/>
-          <w:color w:val="000000"/>
-        </w:rPr>
-      </w:pPr>
-    </w:p>
-    <w:p>
-      <w:pPr>
-        <w:spacing w:before="160" w:after="80" w:line="264" w:lineRule="auto"/>
-        <w:jc w:val="center"/>
-        <w:rPr>
-          <w:rFonts w:ascii="Bookman Old Style" w:hAnsi="Bookman Old Style"/>
+          <w:sz w:val="24"/>
+          <w:szCs w:val="24"/>
         </w:rPr>
       </w:pPr>
       <w:r>
         <w:rPr>
           <w:rFonts w:ascii="Bookman Old Style" w:hAnsi="Bookman Old Style"/>
           <w:color w:val="000000"/>
+          <w:sz w:val="24"/>
+          <w:szCs w:val="24"/>
         </w:rPr>
         <w:t>under the guidance of</w:t>
       </w:r>
@@ -472,7 +470,8 @@
         <w:tblLook w:val="04A0" w:firstRow="1" w:lastRow="0" w:firstColumn="1" w:lastColumn="0" w:noHBand="0" w:noVBand="1"/>
       </w:tblPr>
       <w:tblGrid>
-        <w:gridCol w:w="9360"/>
+        <w:gridCol w:w="3620"/>
+        <w:gridCol w:w="4254"/>
       </w:tblGrid>
       <w:tr>
         <w:trPr>
@@ -480,11 +479,10 @@
         </w:trPr>
         <w:tc>
           <w:tcPr>
-            <w:tcW w:w="9360" w:type="dxa"/>
+            <w:tcW w:w="3620" w:type="dxa"/>
           </w:tcPr>
           <w:p>
             <w:pPr>
-              <w:jc w:val="center"/>
               <w:rPr>
                 <w:rFonts w:ascii="Bookman Old Style" w:hAnsi="Bookman Old Style"/>
               </w:rPr>
@@ -494,7 +492,116 @@
                 <w:rFonts w:ascii="Bookman Old Style" w:hAnsi="Bookman Old Style"/>
                 <w:b/>
               </w:rPr>
-              <w:t>Prof. Chandrani Chakravorty &amp; Prof. Prashanth K</w:t>
+              <w:t>Prof. Chandrani Chakravorty</w:t>
+            </w:r>
+          </w:p>
+          <w:p>
+            <w:pPr>
+              <w:rPr>
+                <w:rFonts w:ascii="Bookman Old Style" w:hAnsi="Bookman Old Style"/>
+              </w:rPr>
+            </w:pPr>
+            <w:r>
+              <w:rPr>
+                <w:rFonts w:ascii="Bookman Old Style" w:hAnsi="Bookman Old Style"/>
+              </w:rPr>
+              <w:t>Assistant Professor</w:t>
+            </w:r>
+          </w:p>
+          <w:p>
+            <w:pPr>
+              <w:rPr>
+                <w:rFonts w:ascii="Bookman Old Style" w:hAnsi="Bookman Old Style"/>
+              </w:rPr>
+            </w:pPr>
+            <w:r>
+              <w:rPr>
+                <w:rFonts w:ascii="Bookman Old Style" w:hAnsi="Bookman Old Style"/>
+              </w:rPr>
+              <w:t>Department of MCA</w:t>
+            </w:r>
+          </w:p>
+          <w:p>
+            <w:pPr>
+              <w:rPr>
+                <w:rFonts w:ascii="Bookman Old Style" w:hAnsi="Bookman Old Style"/>
+              </w:rPr>
+            </w:pPr>
+            <w:r>
+              <w:rPr>
+                <w:rFonts w:ascii="Bookman Old Style" w:hAnsi="Bookman Old Style"/>
+              </w:rPr>
+              <w:t>RV College of Engineering</w:t>
+            </w:r>
+          </w:p>
+        </w:tc>
+        <w:tc>
+          <w:tcPr>
+            <w:tcW w:w="4254" w:type="dxa"/>
+          </w:tcPr>
+          <w:p>
+            <w:pPr>
+              <w:jc w:val="right"/>
+              <w:rPr>
+                <w:rFonts w:ascii="Bookman Old Style" w:hAnsi="Bookman Old Style"/>
+              </w:rPr>
+            </w:pPr>
+            <w:r>
+              <w:rPr>
+                <w:rFonts w:ascii="Bookman Old Style" w:hAnsi="Bookman Old Style"/>
+                <w:b/>
+              </w:rPr>
+              <w:t xml:space="preserve">Prof. </w:t>
+            </w:r>
+            <w:r>
+              <w:rPr>
+                <w:rFonts w:ascii="Bookman Old Style" w:hAnsi="Bookman Old Style"/>
+                <w:b/>
+              </w:rPr>
+              <w:t>Prashanth K</w:t>
+            </w:r>
+          </w:p>
+          <w:p>
+            <w:pPr>
+              <w:jc w:val="right"/>
+              <w:rPr>
+                <w:rFonts w:ascii="Bookman Old Style" w:hAnsi="Bookman Old Style"/>
+              </w:rPr>
+            </w:pPr>
+            <w:r>
+              <w:rPr>
+                <w:rFonts w:ascii="Bookman Old Style" w:hAnsi="Bookman Old Style"/>
+              </w:rPr>
+              <w:t>Assistant Professor</w:t>
+            </w:r>
+          </w:p>
+          <w:p>
+            <w:pPr>
+              <w:jc w:val="right"/>
+              <w:rPr>
+                <w:rFonts w:ascii="Bookman Old Style" w:hAnsi="Bookman Old Style"/>
+              </w:rPr>
+            </w:pPr>
+            <w:r>
+              <w:rPr>
+                <w:rFonts w:ascii="Bookman Old Style" w:hAnsi="Bookman Old Style"/>
+              </w:rPr>
+              <w:t>Department of MCA</w:t>
+            </w:r>
+          </w:p>
+          <w:p>
+            <w:pPr>
+              <w:jc w:val="right"/>
+              <w:rPr>
+                <w:rFonts w:ascii="Bookman Old Style" w:hAnsi="Bookman Old Style"/>
+                <w:b/>
+              </w:rPr>
+            </w:pPr>
+            <w:r>
+              <w:rPr>
+                <w:rFonts w:ascii="Bookman Old Style" w:hAnsi="Bookman Old Style"/>
+              </w:rPr>
+              <w:t>RV College of Engineering</w:t>
             </w:r>
           </w:p>
         </w:tc>
@@ -506,6 +613,21 @@
         <w:jc w:val="center"/>
         <w:rPr>
           <w:rFonts w:ascii="Bookman Old Style" w:hAnsi="Bookman Old Style"/>
+          <w:b/>
+          <w:color w:val="000000"/>
+          <w:sz w:val="24"/>
+          <w:szCs w:val="24"/>
+        </w:rPr>
+      </w:pPr>
+    </w:p>
+    <w:p>
+      <w:pPr>
+        <w:spacing w:before="200" w:after="0" w:line="264" w:lineRule="auto"/>
+        <w:jc w:val="center"/>
+        <w:rPr>
+          <w:rFonts w:ascii="Bookman Old Style" w:hAnsi="Bookman Old Style"/>
+          <w:sz w:val="24"/>
+          <w:szCs w:val="24"/>
         </w:rPr>
       </w:pPr>
       <w:r>
@@ -513,6 +635,8 @@
           <w:rFonts w:ascii="Bookman Old Style" w:hAnsi="Bookman Old Style"/>
           <w:b/>
           <w:color w:val="000000"/>
+          <w:sz w:val="24"/>
+          <w:szCs w:val="24"/>
         </w:rPr>
         <w:t>Department of Master of Computer Applications</w:t>
       </w:r>
@@ -523,6 +647,8 @@
         <w:jc w:val="center"/>
         <w:rPr>
           <w:rFonts w:ascii="Bookman Old Style" w:hAnsi="Bookman Old Style"/>
+          <w:sz w:val="24"/>
+          <w:szCs w:val="24"/>
         </w:rPr>
       </w:pPr>
       <w:r>
@@ -530,6 +656,8 @@
           <w:rFonts w:ascii="Bookman Old Style" w:hAnsi="Bookman Old Style"/>
           <w:b/>
           <w:color w:val="000000"/>
+          <w:sz w:val="24"/>
+          <w:szCs w:val="24"/>
         </w:rPr>
         <w:t>RV College of Engineering, Bengaluru – 560059</w:t>
       </w:r>
@@ -540,6 +668,8 @@
         <w:jc w:val="center"/>
         <w:rPr>
           <w:rFonts w:ascii="Bookman Old Style" w:hAnsi="Bookman Old Style"/>
+          <w:sz w:val="24"/>
+          <w:szCs w:val="24"/>
         </w:rPr>
       </w:pPr>
       <w:r>
@@ -547,12 +677,15 @@
           <w:rFonts w:ascii="Bookman Old Style" w:hAnsi="Bookman Old Style"/>
           <w:b/>
           <w:color w:val="000000"/>
+          <w:sz w:val="24"/>
+          <w:szCs w:val="24"/>
         </w:rPr>
         <w:t>2025-2026</w:t>
       </w:r>
     </w:p>
     <w:p>
       <w:pPr>
+        <w:jc w:val="center"/>
         <w:rPr>
           <w:rFonts w:ascii="Bookman Old Style" w:hAnsi="Bookman Old Style"/>
         </w:rPr>
@@ -563,14 +696,6 @@
         </w:rPr>
         <w:br w:type="page"/>
       </w:r>
-    </w:p>
-    <w:p>
-      <w:pPr>
-        <w:jc w:val="center"/>
-        <w:rPr>
-          <w:rFonts w:ascii="Bookman Old Style" w:hAnsi="Bookman Old Style"/>
-        </w:rPr>
-      </w:pPr>
       <w:r>
         <w:rPr>
           <w:rFonts w:ascii="Bookman Old Style" w:hAnsi="Bookman Old Style"/>
@@ -701,19 +826,29 @@
         <w:t xml:space="preserve"> who have successfully completed the project for the final SEE Lab Examination, incorporating all concepts of the course conducted by the Department of MCA, RV College of Engineering, Bengaluru.</w:t>
       </w:r>
     </w:p>
+    <w:p>
+      <w:pPr>
+        <w:spacing w:after="200" w:line="360" w:lineRule="auto"/>
+        <w:jc w:val="both"/>
+        <w:rPr>
+          <w:rFonts w:ascii="Bookman Old Style" w:hAnsi="Bookman Old Style"/>
+        </w:rPr>
+      </w:pPr>
+    </w:p>
     <w:tbl>
       <w:tblPr>
         <w:tblW w:w="0" w:type="auto"/>
         <w:tblLook w:val="04A0" w:firstRow="1" w:lastRow="0" w:firstColumn="1" w:lastColumn="0" w:noHBand="0" w:noVBand="1"/>
       </w:tblPr>
       <w:tblGrid>
-        <w:gridCol w:w="4680"/>
-        <w:gridCol w:w="4680"/>
+        <w:gridCol w:w="3528"/>
+        <w:gridCol w:w="2610"/>
+        <w:gridCol w:w="3104"/>
       </w:tblGrid>
       <w:tr>
         <w:tc>
           <w:tcPr>
-            <w:tcW w:w="4680" w:type="dxa"/>
+            <w:tcW w:w="3528" w:type="dxa"/>
           </w:tcPr>
           <w:p>
             <w:pPr>
@@ -773,6 +908,7 @@
             <w:pPr>
               <w:rPr>
                 <w:rFonts w:ascii="Bookman Old Style" w:hAnsi="Bookman Old Style"/>
+                <w:b/>
               </w:rPr>
             </w:pPr>
             <w:r>
@@ -785,7 +921,90 @@
         </w:tc>
         <w:tc>
           <w:tcPr>
-            <w:tcW w:w="4680" w:type="dxa"/>
+            <w:tcW w:w="2610" w:type="dxa"/>
+          </w:tcPr>
+          <w:p>
+            <w:pPr>
+              <w:jc w:val="center"/>
+              <w:rPr>
+                <w:rFonts w:ascii="Bookman Old Style" w:hAnsi="Bookman Old Style"/>
+              </w:rPr>
+            </w:pPr>
+            <w:r>
+              <w:rPr>
+                <w:rFonts w:ascii="Bookman Old Style" w:hAnsi="Bookman Old Style"/>
+                <w:b/>
+              </w:rPr>
+              <w:t>Internal Guide</w:t>
+            </w:r>
+          </w:p>
+          <w:p>
+            <w:pPr>
+              <w:jc w:val="center"/>
+              <w:rPr>
+                <w:rFonts w:ascii="Bookman Old Style" w:hAnsi="Bookman Old Style"/>
+                <w:b/>
+              </w:rPr>
+            </w:pPr>
+            <w:r>
+              <w:rPr>
+                <w:rFonts w:ascii="Bookman Old Style" w:hAnsi="Bookman Old Style"/>
+                <w:b/>
+              </w:rPr>
+              <w:t>Prof. Prashanth K</w:t>
+            </w:r>
+          </w:p>
+          <w:p>
+            <w:pPr>
+              <w:jc w:val="center"/>
+              <w:rPr>
+                <w:rFonts w:ascii="Bookman Old Style" w:hAnsi="Bookman Old Style"/>
+                <w:bCs/>
+              </w:rPr>
+            </w:pPr>
+            <w:r>
+              <w:rPr>
+                <w:rFonts w:ascii="Bookman Old Style" w:hAnsi="Bookman Old Style"/>
+                <w:bCs/>
+              </w:rPr>
+              <w:t>Assistant Professor</w:t>
+            </w:r>
+          </w:p>
+          <w:p>
+            <w:pPr>
+              <w:jc w:val="center"/>
+              <w:rPr>
+                <w:rFonts w:ascii="Bookman Old Style" w:hAnsi="Bookman Old Style"/>
+                <w:bCs/>
+              </w:rPr>
+            </w:pPr>
+            <w:r>
+              <w:rPr>
+                <w:rFonts w:ascii="Bookman Old Style" w:hAnsi="Bookman Old Style"/>
+                <w:bCs/>
+              </w:rPr>
+              <w:t>Department of MCA</w:t>
+            </w:r>
+          </w:p>
+          <w:p>
+            <w:pPr>
+              <w:jc w:val="center"/>
+              <w:rPr>
+                <w:rFonts w:ascii="Bookman Old Style" w:hAnsi="Bookman Old Style"/>
+              </w:rPr>
+            </w:pPr>
+            <w:r>
+              <w:rPr>
+                <w:rFonts w:ascii="Bookman Old Style" w:hAnsi="Bookman Old Style"/>
+                <w:bCs/>
+              </w:rPr>
+              <w:t>RV College of Engineering</w:t>
+            </w:r>
+          </w:p>
+        </w:tc>
+        <w:tc>
+          <w:tcPr>
+            <w:tcW w:w="3104" w:type="dxa"/>
           </w:tcPr>
           <w:p>
             <w:pPr>
@@ -966,12 +1185,6 @@
       <w:r>
         <w:br w:type="page"/>
       </w:r>
-    </w:p>
-    <w:p>
-      <w:pPr>
-        <w:spacing w:after="240"/>
-        <w:jc w:val="center"/>
-      </w:pPr>
       <w:r>
         <w:rPr>
           <w:b/>
@@ -1184,7 +1397,7 @@
             <w:noProof/>
             <w:webHidden/>
           </w:rPr>
-          <w:t>7</w:t>
+          <w:t>8</w:t>
         </w:r>
         <w:r>
           <w:rPr>
@@ -1524,7 +1737,7 @@
             <w:noProof/>
             <w:webHidden/>
           </w:rPr>
-          <w:t>8</w:t>
+          <w:t>9</w:t>
         </w:r>
         <w:r>
           <w:rPr>
@@ -1592,7 +1805,7 @@
             <w:noProof/>
             <w:webHidden/>
           </w:rPr>
-          <w:t>8</w:t>
+          <w:t>9</w:t>
         </w:r>
         <w:r>
           <w:rPr>
@@ -1932,7 +2145,7 @@
             <w:noProof/>
             <w:webHidden/>
           </w:rPr>
-          <w:t>9</w:t>
+          <w:t>10</w:t>
         </w:r>
         <w:r>
           <w:rPr>
@@ -2136,7 +2349,7 @@
             <w:noProof/>
             <w:webHidden/>
           </w:rPr>
-          <w:t>10</w:t>
+          <w:t>11</w:t>
         </w:r>
         <w:r>
           <w:rPr>
@@ -2476,7 +2689,7 @@
             <w:noProof/>
             <w:webHidden/>
           </w:rPr>
-          <w:t>11</w:t>
+          <w:t>12</w:t>
         </w:r>
         <w:r>
           <w:rPr>
@@ -2544,7 +2757,7 @@
             <w:noProof/>
             <w:webHidden/>
           </w:rPr>
-          <w:t>11</w:t>
+          <w:t>12</w:t>
         </w:r>
         <w:r>
           <w:rPr>
@@ -2748,7 +2961,7 @@
             <w:noProof/>
             <w:webHidden/>
           </w:rPr>
-          <w:t>12</w:t>
+          <w:t>13</w:t>
         </w:r>
         <w:r>
           <w:rPr>
@@ -2816,7 +3029,7 @@
             <w:noProof/>
             <w:webHidden/>
           </w:rPr>
-          <w:t>12</w:t>
+          <w:t>13</w:t>
         </w:r>
         <w:r>
           <w:rPr>
@@ -2884,7 +3097,7 @@
             <w:noProof/>
             <w:webHidden/>
           </w:rPr>
-          <w:t>13</w:t>
+          <w:t>14</w:t>
         </w:r>
         <w:r>
           <w:rPr>
@@ -2952,7 +3165,7 @@
             <w:noProof/>
             <w:webHidden/>
           </w:rPr>
-          <w:t>14</w:t>
+          <w:t>15</w:t>
         </w:r>
         <w:r>
           <w:rPr>
@@ -3020,7 +3233,7 @@
             <w:noProof/>
             <w:webHidden/>
           </w:rPr>
-          <w:t>15</w:t>
+          <w:t>16</w:t>
         </w:r>
         <w:r>
           <w:rPr>
@@ -3088,7 +3301,7 @@
             <w:noProof/>
             <w:webHidden/>
           </w:rPr>
-          <w:t>17</w:t>
+          <w:t>18</w:t>
         </w:r>
         <w:r>
           <w:rPr>
@@ -3156,7 +3369,7 @@
             <w:noProof/>
             <w:webHidden/>
           </w:rPr>
-          <w:t>18</w:t>
+          <w:t>19</w:t>
         </w:r>
         <w:r>
           <w:rPr>
@@ -3224,7 +3437,7 @@
             <w:noProof/>
             <w:webHidden/>
           </w:rPr>
-          <w:t>18</w:t>
+          <w:t>19</w:t>
         </w:r>
         <w:r>
           <w:rPr>
@@ -3292,7 +3505,7 @@
             <w:noProof/>
             <w:webHidden/>
           </w:rPr>
-          <w:t>18</w:t>
+          <w:t>19</w:t>
         </w:r>
         <w:r>
           <w:rPr>
@@ -3360,7 +3573,7 @@
             <w:noProof/>
             <w:webHidden/>
           </w:rPr>
-          <w:t>18</w:t>
+          <w:t>20</w:t>
         </w:r>
         <w:r>
           <w:rPr>
@@ -3428,7 +3641,7 @@
             <w:noProof/>
             <w:webHidden/>
           </w:rPr>
-          <w:t>19</w:t>
+          <w:t>20</w:t>
         </w:r>
         <w:r>
           <w:rPr>
@@ -3496,7 +3709,7 @@
             <w:noProof/>
             <w:webHidden/>
           </w:rPr>
-          <w:t>20</w:t>
+          <w:t>21</w:t>
         </w:r>
         <w:r>
           <w:rPr>
@@ -3564,7 +3777,7 @@
             <w:noProof/>
             <w:webHidden/>
           </w:rPr>
-          <w:t>21</w:t>
+          <w:t>22</w:t>
         </w:r>
         <w:r>
           <w:rPr>
@@ -3632,7 +3845,7 @@
             <w:noProof/>
             <w:webHidden/>
           </w:rPr>
-          <w:t>21</w:t>
+          <w:t>22</w:t>
         </w:r>
         <w:r>
           <w:rPr>
@@ -3700,7 +3913,7 @@
             <w:noProof/>
             <w:webHidden/>
           </w:rPr>
-          <w:t>21</w:t>
+          <w:t>22</w:t>
         </w:r>
         <w:r>
           <w:rPr>
@@ -3768,7 +3981,7 @@
             <w:noProof/>
             <w:webHidden/>
           </w:rPr>
-          <w:t>21</w:t>
+          <w:t>22</w:t>
         </w:r>
         <w:r>
           <w:rPr>
@@ -3836,7 +4049,7 @@
             <w:noProof/>
             <w:webHidden/>
           </w:rPr>
-          <w:t>21</w:t>
+          <w:t>22</w:t>
         </w:r>
         <w:r>
           <w:rPr>
@@ -3904,7 +4117,7 @@
             <w:noProof/>
             <w:webHidden/>
           </w:rPr>
-          <w:t>21</w:t>
+          <w:t>22</w:t>
         </w:r>
         <w:r>
           <w:rPr>
@@ -3972,7 +4185,7 @@
             <w:noProof/>
             <w:webHidden/>
           </w:rPr>
-          <w:t>21</w:t>
+          <w:t>22</w:t>
         </w:r>
         <w:r>
           <w:rPr>
@@ -4040,7 +4253,7 @@
             <w:noProof/>
             <w:webHidden/>
           </w:rPr>
-          <w:t>21</w:t>
+          <w:t>23</w:t>
         </w:r>
         <w:r>
           <w:rPr>
@@ -4108,7 +4321,7 @@
             <w:noProof/>
             <w:webHidden/>
           </w:rPr>
-          <w:t>22</w:t>
+          <w:t>23</w:t>
         </w:r>
         <w:r>
           <w:rPr>
@@ -4176,7 +4389,7 @@
             <w:noProof/>
             <w:webHidden/>
           </w:rPr>
-          <w:t>22</w:t>
+          <w:t>23</w:t>
         </w:r>
         <w:r>
           <w:rPr>
@@ -4244,7 +4457,7 @@
             <w:noProof/>
             <w:webHidden/>
           </w:rPr>
-          <w:t>22</w:t>
+          <w:t>23</w:t>
         </w:r>
         <w:r>
           <w:rPr>
@@ -4312,7 +4525,7 @@
             <w:noProof/>
             <w:webHidden/>
           </w:rPr>
-          <w:t>22</w:t>
+          <w:t>23</w:t>
         </w:r>
         <w:r>
           <w:rPr>
@@ -4380,7 +4593,7 @@
             <w:noProof/>
             <w:webHidden/>
           </w:rPr>
-          <w:t>22</w:t>
+          <w:t>24</w:t>
         </w:r>
         <w:r>
           <w:rPr>
@@ -4448,7 +4661,7 @@
             <w:noProof/>
             <w:webHidden/>
           </w:rPr>
-          <w:t>23</w:t>
+          <w:t>24</w:t>
         </w:r>
         <w:r>
           <w:rPr>
@@ -4502,9 +4715,9 @@
         <w:tblLook w:val="04A0" w:firstRow="1" w:lastRow="0" w:firstColumn="1" w:lastColumn="0" w:noHBand="0" w:noVBand="1"/>
       </w:tblPr>
       <w:tblGrid>
-        <w:gridCol w:w="974"/>
-        <w:gridCol w:w="7406"/>
-        <w:gridCol w:w="906"/>
+        <w:gridCol w:w="967"/>
+        <w:gridCol w:w="7253"/>
+        <w:gridCol w:w="896"/>
       </w:tblGrid>
       <w:tr>
         <w:trPr>
@@ -5847,7 +6060,7 @@
           <w:szCs w:val="24"/>
         </w:rPr>
         <w:sectPr>
-          <w:pgSz w:w="12240" w:h="15840"/>
+          <w:pgSz w:w="11906" w:h="16838" w:code="9"/>
           <w:pgMar w:top="1440" w:right="1440" w:bottom="1440" w:left="1440" w:header="720" w:footer="720" w:gutter="0"/>
           <w:cols w:space="720"/>
           <w:docGrid w:linePitch="360"/>
@@ -10333,7 +10546,7 @@
         </mc:Choice>
         <mc:Fallback>
           <w:pict>
-            <v:line w14:anchorId="2025F0E2" id="Straight Connector 1" o:spid="_x0000_s1026" style="position:absolute;z-index:251659776;visibility:visible;mso-wrap-style:square;mso-wrap-distance-left:9pt;mso-wrap-distance-top:0;mso-wrap-distance-right:9pt;mso-wrap-distance-bottom:0;mso-position-horizontal:absolute;mso-position-horizontal-relative:text;mso-position-vertical:absolute;mso-position-vertical-relative:text" from="-3.65pt,-3.3pt" to="470pt,-3.3pt" o:gfxdata="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" strokecolor="black [3040]"/>
+            <v:line w14:anchorId="7A64E924" id="Straight Connector 1" o:spid="_x0000_s1026" style="position:absolute;z-index:251659776;visibility:visible;mso-wrap-style:square;mso-wrap-distance-left:9pt;mso-wrap-distance-top:0;mso-wrap-distance-right:9pt;mso-wrap-distance-bottom:0;mso-position-horizontal:absolute;mso-position-horizontal-relative:text;mso-position-vertical:absolute;mso-position-vertical-relative:text" from="-3.65pt,-3.3pt" to="470pt,-3.3pt" o:gfxdata="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" strokecolor="black [3040]"/>
           </w:pict>
         </mc:Fallback>
       </mc:AlternateContent>
@@ -10460,7 +10673,7 @@
         </mc:Choice>
         <mc:Fallback>
           <w:pict>
-            <v:line w14:anchorId="54F73F46" id="Straight Connector 1" o:spid="_x0000_s1026" style="position:absolute;z-index:251656704;visibility:visible;mso-wrap-style:square;mso-wrap-distance-left:9pt;mso-wrap-distance-top:0;mso-wrap-distance-right:9pt;mso-wrap-distance-bottom:0;mso-position-horizontal:absolute;mso-position-horizontal-relative:text;mso-position-vertical:absolute;mso-position-vertical-relative:text" from="-3.65pt,14pt" to="470pt,14pt" o:gfxdata="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" strokecolor="black [3040]"/>
+            <v:line w14:anchorId="04B65F46" id="Straight Connector 1" o:spid="_x0000_s1026" style="position:absolute;z-index:251656704;visibility:visible;mso-wrap-style:square;mso-wrap-distance-left:9pt;mso-wrap-distance-top:0;mso-wrap-distance-right:9pt;mso-wrap-distance-bottom:0;mso-position-horizontal:absolute;mso-position-horizontal-relative:text;mso-position-vertical:absolute;mso-position-vertical-relative:text" from="-3.65pt,14pt" to="470pt,14pt" o:gfxdata="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" strokecolor="black [3040]"/>
           </w:pict>
         </mc:Fallback>
       </mc:AlternateContent>
@@ -10652,7 +10865,7 @@
   <w:abstractNum w:abstractNumId="8" w15:restartNumberingAfterBreak="0">
     <w:nsid w:val="FFFFFF89"/>
     <w:multiLevelType w:val="singleLevel"/>
-    <w:tmpl w:val="29761A62"/>
+    <w:tmpl w:val="B558726C"/>
     <w:lvl w:ilvl="0">
       <w:start w:val="1"/>
       <w:numFmt w:val="bullet"/>
@@ -11089,7 +11302,7 @@
   <w:style w:type="paragraph" w:default="1" w:styleId="Normal">
     <w:name w:val="Normal"/>
     <w:qFormat/>
-    <w:rsid w:val="00FC693F"/>
+    <w:rsid w:val="00DF0372"/>
     <w:pPr>
       <w:spacing w:after="120"/>
     </w:pPr>

</xml_diff>